<commit_message>
Update paper files with Zenodo DOI
</commit_message>
<xml_diff>
--- a/paper/spectral_participation_SU3_holonomy.docx
+++ b/paper/spectral_participation_SU3_holonomy.docx
@@ -27,12 +27,24 @@
       <w:pPr>
         <w:jc w:val="center"/>
       </w:pPr>
+      <w:r/>
       <w:r>
+        <w:rPr>
+          <w:b/>
+        </w:rPr>
         <w:t>Gregorio Rozas Fernández</w:t>
+      </w:r>
+      <w:r>
         <w:br/>
         <w:t>Independent Researcher</w:t>
+      </w:r>
+      <w:r>
         <w:br/>
-        <w:t>Draft for scientific circulation - September 2026</w:t>
+        <w:t>Preprint v1.0.0 - September 2026</w:t>
+      </w:r>
+      <w:r>
+        <w:br/>
+        <w:t>DOI: 10.5281/zenodo.22736817</w:t>
       </w:r>
     </w:p>
     <w:p>

</xml_diff>